<commit_message>
feat: interfaz movil con login, movimientos parciales en kg y guia de comandos
- app/static/index.html reconstruida: login, tarjetas en telefono, tabla en tablet/escritorio,
  modal de movimiento con cantidad (parcialidad) y motivo, historial por lote, deshacer y borrar.
- app/usuarios.py + scripts/crear_usuario.py: roles admin/almacen/consulta, PBKDF2, reset desde consola.
- Movimientos parciales: se mueven solo los kg indicados, el resto queda en el rack y se crea
  un renglon nuevo en el destino (accion PARCIAL con cantidad y fila_destino).
- docs/Guia_instalacion_comandos.md/.docx/.pdf (6 pag.: cmd, powershell, firewall, tareas, respaldo).
- LEEME_INSTALACION y README actualizados: usuarios, parcialidades, telefono, guia nueva.
- Capturas de la interfaz en 390x844, 820x1180 y 1280x900; demo con 4 usuarios.
- Tests: 41 OK.
</commit_message>
<xml_diff>
--- a/docs/Guia_operativa_ubicacion_almacen.docx
+++ b/docs/Guia_operativa_ubicacion_almacen.docx
@@ -134,7 +134,7 @@
               <w:rPr>
                 <w:sz w:val="16"/>
               </w:rPr>
-              <w:t>137</w:t>
+              <w:t>135</w:t>
             </w:r>
           </w:p>
         </w:tc>
@@ -194,7 +194,7 @@
               <w:rPr>
                 <w:sz w:val="16"/>
               </w:rPr>
-              <w:t>0 de 137</w:t>
+              <w:t>0 de 135</w:t>
             </w:r>
           </w:p>
         </w:tc>
@@ -224,7 +224,7 @@
               <w:rPr>
                 <w:sz w:val="16"/>
               </w:rPr>
-              <w:t>29</w:t>
+              <w:t>28</w:t>
             </w:r>
           </w:p>
         </w:tc>
@@ -313,7 +313,7 @@
           <w:color w:val="1F3B73"/>
           <w:sz w:val="22"/>
         </w:rPr>
-        <w:t>2. Cómo se usa (tres pasos, 15 segundos)</w:t>
+        <w:t>2. Cómo se usa (cuatro pasos, menos de un minuto)</w:t>
       </w:r>
     </w:p>
     <w:p>
@@ -325,7 +325,7 @@
           <w:b w:val="0"/>
           <w:sz w:val="18"/>
         </w:rPr>
-        <w:t>• Abrir el sistema: doble clic en arrancar.cmd de la carpeta del proyecto. Se abre en el navegador.</w:t>
+        <w:t>• Abrir el sistema: doble clic en arrancar.cmd. Se abre en el navegador y pide usuario y contraseña (cada movimiento queda firmado con quien lo hizo).</w:t>
       </w:r>
     </w:p>
     <w:p>
@@ -337,7 +337,7 @@
           <w:b w:val="0"/>
           <w:sz w:val="18"/>
         </w:rPr>
-        <w:t>• Escribir tu nombre la primera vez. Queda registrado en cada movimiento que hagas.</w:t>
+        <w:t>• Buscar el material o el lote y teclear el código del rack en la columna UBICACIÓN, o usar «Registrar movimiento» para cambiarlo de lugar eligiendo el motivo.</w:t>
       </w:r>
     </w:p>
     <w:p>
@@ -349,7 +349,19 @@
           <w:b w:val="0"/>
           <w:sz w:val="18"/>
         </w:rPr>
-        <w:t>• Buscar el material o el lote, teclear el código del rack en la columna UBICACIÓN y dar Enter. Si no aparece, botón «no está» y anotas qué pasó.</w:t>
+        <w:t>• Si se mueven solo unos kilos, escribir esa cantidad en el modal: el resto se queda en su rack y se crea un renglón nuevo con la parte movida (acción PARCIAL en la bitácora).</w:t>
+      </w:r>
+    </w:p>
+    <w:p>
+      <w:pPr>
+        <w:spacing w:after="60"/>
+      </w:pPr>
+      <w:r>
+        <w:rPr>
+          <w:b w:val="0"/>
+          <w:sz w:val="18"/>
+        </w:rPr>
+        <w:t>• Si hubo un error, pestaña Movimientos → Deshacer (el último del lote). El administrador puede borrar una captura de prueba dejando motivo y registro de auditoría.</w:t>
       </w:r>
     </w:p>
     <w:p>

</xml_diff>